<commit_message>
Documentation and deliverables polish for publication
- Professional tone pass across README, demo guide, submission checklist,
  deck and report generators; corrected informal phrasing
- Repository evaluation results now carry deterministic-only provenance;
  LLM-dependent tables state explicitly that they are populated by the
  demo-machine run (no reference-harness numbers in deliverables)
- Report and deck degrade gracefully where demo-machine measurements are
  pending; removed a hardcoded fallback figure
- Dynamic query counts in the evaluation report; clarified skipped-section
  wording
</commit_message>
<xml_diff>
--- a/deliverables/FlexiGrid_AI_Technical_Report.docx
+++ b/deliverables/FlexiGrid_AI_Technical_Report.docx
@@ -2157,7 +2157,7 @@
           <w:color w:val="23322E"/>
           <w:sz w:val="21"/>
         </w:rPr>
-        <w:t>This is now a measured claim, not a design opinion. Baseline B in the evaluation asks the model (mock-planner-1) to assign start hours directly, with the tasks, windows, tariff and cap in the prompt and a validated output schema — everything except the optimizer. Its constraint violation-or-failure rate is 0.667 in the current harness run, against 0 for the deterministic search. Language models produce locally plausible schedules that are globally capacity-blind; the hybrid design exists because of exactly this measurement.</w:t>
+        <w:t>This is a measured claim, not a design opinion. Baseline B in the evaluation asks the model to assign start hours directly, with the tasks, windows, tariff and cap in the prompt and a validated output schema — everything except the optimizer. The recorded rate for the defense machine's model is produced by `python -m flexigrid.evaluate` and appears in evaluation/RESULTS.md; the deterministic search records 0 violations under the same conditions. Language models produce locally plausible schedules that are globally capacity-blind; the hybrid design follows from exactly this measurement.</w:t>
       </w:r>
     </w:p>
     <w:p>
@@ -2179,7 +2179,7 @@
           <w:color w:val="23322E"/>
           <w:sz w:val="21"/>
         </w:rPr>
-        <w:t>Fine-tuning is argued out, not ignored: the intent evaluation shows where it would help (per-task deadlines, unusual phrasings), and a LoRA pass on synthetic mission-to-JSON pairs is the natural next step once prompting is demonstrably the bottleneck — today the sanitizer plus repair loop closes most of the gap at zero training cost. Diffusion and multimodal models are excluded because the problem contains no image or audio modality and no generative sampling need; including them would be technique tourism. The included techniques each carry a measurable role, which we consider the stronger answer to 'choose multiple technologies'.</w:t>
+        <w:t>Fine-tuning is excluded with an argument, not ignored: the intent evaluation identifies where it would help (per-task deadlines, unusual phrasings), and a LoRA pass on synthetic mission-to-JSON pairs is the designated next step once prompting is demonstrably the bottleneck — currently the sanitizer plus the repair loop closes most of the gap at zero training cost. Diffusion and multimodal models are excluded because the problem contains no image or audio modality and no generative-sampling need; they would add scope without a role the problem can justify. Every included technique carries a measurable responsibility in the pipeline.</w:t>
       </w:r>
     </w:p>
     <w:p>
@@ -3307,7 +3307,7 @@
           <w:color w:val="23322E"/>
           <w:sz w:val="21"/>
         </w:rPr>
-        <w:t>Evaluation is split by subsystem so a fluent answer can never hide a retrieval, intent, planning or grounding failure. Numbers in this section come from evaluation/results.json, generated 2026-08-24T12:07:24+00:00 with LLM mock-planner-1 and embedding backend ollama (mock-embed) over 51 corpus chunks. Re-running the harness on the demo machine refreshes every table with that machine's provenance.</w:t>
+        <w:t>Evaluation is split by subsystem so a fluent answer can never hide a retrieval, intent, planning or grounding failure. Numbers in this section come from evaluation/results.json, generated 2026-08-24T12:18:23+00:00 with LLM disabled (deterministic fallback) and embedding backend tfidf (tfidf-svd-128) over 51 corpus chunks. Re-running the harness on the demo machine refreshes every table with that machine's provenance.</w:t>
       </w:r>
     </w:p>
     <w:p>
@@ -3723,7 +3723,7 @@
                 <w:color w:val="23322E"/>
                 <w:sz w:val="16"/>
               </w:rPr>
-              <w:t>0.65</w:t>
+              <w:t>0.95</w:t>
             </w:r>
           </w:p>
         </w:tc>
@@ -3756,7 +3756,7 @@
                 <w:color w:val="23322E"/>
                 <w:sz w:val="16"/>
               </w:rPr>
-              <w:t>0.9</w:t>
+              <w:t>0.988</w:t>
             </w:r>
           </w:p>
         </w:tc>
@@ -3789,7 +3789,7 @@
                 <w:color w:val="23322E"/>
                 <w:sz w:val="16"/>
               </w:rPr>
-              <w:t>0.762</w:t>
+              <w:t>0.967</w:t>
             </w:r>
           </w:p>
         </w:tc>
@@ -3857,7 +3857,7 @@
                 <w:color w:val="23322E"/>
                 <w:sz w:val="16"/>
               </w:rPr>
-              <w:t>0.875</w:t>
+              <w:t>0.95</w:t>
             </w:r>
           </w:p>
         </w:tc>
@@ -3923,7 +3923,7 @@
                 <w:color w:val="23322E"/>
                 <w:sz w:val="16"/>
               </w:rPr>
-              <w:t>0.938</w:t>
+              <w:t>0.971</w:t>
             </w:r>
           </w:p>
         </w:tc>
@@ -4218,206 +4218,6 @@
                 <w:sz w:val="16"/>
               </w:rPr>
               <w:t>rules</w:t>
-            </w:r>
-          </w:p>
-        </w:tc>
-        <w:tc>
-          <w:tcPr>
-            <w:tcW w:type="dxa" w:w="1490"/>
-            <w:tcMar>
-              <w:top w:w="80" w:type="dxa"/>
-              <w:start w:w="120" w:type="dxa"/>
-              <w:bottom w:w="80" w:type="dxa"/>
-              <w:end w:w="120" w:type="dxa"/>
-            </w:tcMar>
-            <w:tcBorders>
-              <w:top w:val="single" w:sz="6" w:color="DDE6E1"/>
-              <w:start w:val="single" w:sz="6" w:color="DDE6E1"/>
-              <w:bottom w:val="single" w:sz="6" w:color="DDE6E1"/>
-              <w:end w:val="single" w:sz="6" w:color="DDE6E1"/>
-              <w:insideH w:val="single" w:sz="6" w:color="DDE6E1"/>
-              <w:insideV w:val="single" w:sz="6" w:color="DDE6E1"/>
-            </w:tcBorders>
-            <w:vAlign w:val="center"/>
-          </w:tcPr>
-          <w:p>
-            <w:pPr>
-              <w:jc w:val="center"/>
-            </w:pPr>
-            <w:r>
-              <w:rPr>
-                <w:rFonts w:ascii="Calibri" w:hAnsi="Calibri"/>
-                <w:color w:val="23322E"/>
-                <w:sz w:val="16"/>
-              </w:rPr>
-              <w:t>0.733</w:t>
-            </w:r>
-          </w:p>
-        </w:tc>
-        <w:tc>
-          <w:tcPr>
-            <w:tcW w:type="dxa" w:w="1490"/>
-            <w:tcMar>
-              <w:top w:w="80" w:type="dxa"/>
-              <w:start w:w="120" w:type="dxa"/>
-              <w:bottom w:w="80" w:type="dxa"/>
-              <w:end w:w="120" w:type="dxa"/>
-            </w:tcMar>
-            <w:tcBorders>
-              <w:top w:val="single" w:sz="6" w:color="DDE6E1"/>
-              <w:start w:val="single" w:sz="6" w:color="DDE6E1"/>
-              <w:bottom w:val="single" w:sz="6" w:color="DDE6E1"/>
-              <w:end w:val="single" w:sz="6" w:color="DDE6E1"/>
-              <w:insideH w:val="single" w:sz="6" w:color="DDE6E1"/>
-              <w:insideV w:val="single" w:sz="6" w:color="DDE6E1"/>
-            </w:tcBorders>
-            <w:vAlign w:val="center"/>
-          </w:tcPr>
-          <w:p>
-            <w:pPr>
-              <w:jc w:val="center"/>
-            </w:pPr>
-            <w:r>
-              <w:rPr>
-                <w:rFonts w:ascii="Calibri" w:hAnsi="Calibri"/>
-                <w:color w:val="23322E"/>
-                <w:sz w:val="16"/>
-              </w:rPr>
-              <w:t>0.933</w:t>
-            </w:r>
-          </w:p>
-        </w:tc>
-        <w:tc>
-          <w:tcPr>
-            <w:tcW w:type="dxa" w:w="1500"/>
-            <w:tcMar>
-              <w:top w:w="80" w:type="dxa"/>
-              <w:start w:w="120" w:type="dxa"/>
-              <w:bottom w:w="80" w:type="dxa"/>
-              <w:end w:w="120" w:type="dxa"/>
-            </w:tcMar>
-            <w:tcBorders>
-              <w:top w:val="single" w:sz="6" w:color="DDE6E1"/>
-              <w:start w:val="single" w:sz="6" w:color="DDE6E1"/>
-              <w:bottom w:val="single" w:sz="6" w:color="DDE6E1"/>
-              <w:end w:val="single" w:sz="6" w:color="DDE6E1"/>
-              <w:insideH w:val="single" w:sz="6" w:color="DDE6E1"/>
-              <w:insideV w:val="single" w:sz="6" w:color="DDE6E1"/>
-            </w:tcBorders>
-            <w:vAlign w:val="center"/>
-          </w:tcPr>
-          <w:p>
-            <w:pPr>
-              <w:jc w:val="center"/>
-            </w:pPr>
-            <w:r>
-              <w:rPr>
-                <w:rFonts w:ascii="Calibri" w:hAnsi="Calibri"/>
-                <w:color w:val="23322E"/>
-                <w:sz w:val="16"/>
-              </w:rPr>
-              <w:t>0.933</w:t>
-            </w:r>
-          </w:p>
-        </w:tc>
-        <w:tc>
-          <w:tcPr>
-            <w:tcW w:type="dxa" w:w="1490"/>
-            <w:tcMar>
-              <w:top w:w="80" w:type="dxa"/>
-              <w:start w:w="120" w:type="dxa"/>
-              <w:bottom w:w="80" w:type="dxa"/>
-              <w:end w:w="120" w:type="dxa"/>
-            </w:tcMar>
-            <w:tcBorders>
-              <w:top w:val="single" w:sz="6" w:color="DDE6E1"/>
-              <w:start w:val="single" w:sz="6" w:color="DDE6E1"/>
-              <w:bottom w:val="single" w:sz="6" w:color="DDE6E1"/>
-              <w:end w:val="single" w:sz="6" w:color="DDE6E1"/>
-              <w:insideH w:val="single" w:sz="6" w:color="DDE6E1"/>
-              <w:insideV w:val="single" w:sz="6" w:color="DDE6E1"/>
-            </w:tcBorders>
-            <w:vAlign w:val="center"/>
-          </w:tcPr>
-          <w:p>
-            <w:pPr>
-              <w:jc w:val="center"/>
-            </w:pPr>
-            <w:r>
-              <w:rPr>
-                <w:rFonts w:ascii="Calibri" w:hAnsi="Calibri"/>
-                <w:color w:val="23322E"/>
-                <w:sz w:val="16"/>
-              </w:rPr>
-              <w:t>0.867</w:t>
-            </w:r>
-          </w:p>
-        </w:tc>
-        <w:tc>
-          <w:tcPr>
-            <w:tcW w:type="dxa" w:w="1490"/>
-            <w:tcMar>
-              <w:top w:w="80" w:type="dxa"/>
-              <w:start w:w="120" w:type="dxa"/>
-              <w:bottom w:w="80" w:type="dxa"/>
-              <w:end w:w="120" w:type="dxa"/>
-            </w:tcMar>
-            <w:tcBorders>
-              <w:top w:val="single" w:sz="6" w:color="DDE6E1"/>
-              <w:start w:val="single" w:sz="6" w:color="DDE6E1"/>
-              <w:bottom w:val="single" w:sz="6" w:color="DDE6E1"/>
-              <w:end w:val="single" w:sz="6" w:color="DDE6E1"/>
-              <w:insideH w:val="single" w:sz="6" w:color="DDE6E1"/>
-              <w:insideV w:val="single" w:sz="6" w:color="DDE6E1"/>
-            </w:tcBorders>
-            <w:vAlign w:val="center"/>
-          </w:tcPr>
-          <w:p>
-            <w:pPr>
-              <w:jc w:val="center"/>
-            </w:pPr>
-            <w:r>
-              <w:rPr>
-                <w:rFonts w:ascii="Calibri" w:hAnsi="Calibri"/>
-                <w:color w:val="23322E"/>
-                <w:sz w:val="16"/>
-              </w:rPr>
-              <w:t>1.0</w:t>
-            </w:r>
-          </w:p>
-        </w:tc>
-      </w:tr>
-      <w:tr>
-        <w:tc>
-          <w:tcPr>
-            <w:tcW w:type="dxa" w:w="1900"/>
-            <w:tcMar>
-              <w:top w:w="80" w:type="dxa"/>
-              <w:start w:w="120" w:type="dxa"/>
-              <w:bottom w:w="80" w:type="dxa"/>
-              <w:end w:w="120" w:type="dxa"/>
-            </w:tcMar>
-            <w:tcBorders>
-              <w:top w:val="single" w:sz="6" w:color="DDE6E1"/>
-              <w:start w:val="single" w:sz="6" w:color="DDE6E1"/>
-              <w:bottom w:val="single" w:sz="6" w:color="DDE6E1"/>
-              <w:end w:val="single" w:sz="6" w:color="DDE6E1"/>
-              <w:insideH w:val="single" w:sz="6" w:color="DDE6E1"/>
-              <w:insideV w:val="single" w:sz="6" w:color="DDE6E1"/>
-            </w:tcBorders>
-            <w:vAlign w:val="center"/>
-          </w:tcPr>
-          <w:p>
-            <w:pPr>
-              <w:jc w:val="left"/>
-            </w:pPr>
-            <w:r>
-              <w:rPr>
-                <w:rFonts w:ascii="Calibri" w:hAnsi="Calibri"/>
-                <w:color w:val="23322E"/>
-                <w:sz w:val="16"/>
-              </w:rPr>
-              <w:t>llm</w:t>
             </w:r>
           </w:p>
         </w:tc>
@@ -5072,7 +4872,7 @@
                 <w:color w:val="23322E"/>
                 <w:sz w:val="16"/>
               </w:rPr>
-              <w:t>LLM-only (mock-planner-1)</w:t>
+              <w:t>LLM-only (local model)</w:t>
             </w:r>
           </w:p>
         </w:tc>
@@ -5105,7 +4905,7 @@
                 <w:color w:val="23322E"/>
                 <w:sz w:val="16"/>
               </w:rPr>
-              <w:t>0.667 violation/failure rate</w:t>
+              <w:t>measured on the demo machine (see RESULTS.md)</w:t>
             </w:r>
           </w:p>
         </w:tc>
@@ -5138,7 +4938,7 @@
                 <w:color w:val="23322E"/>
                 <w:sz w:val="16"/>
               </w:rPr>
-              <w:t>-0.21 € avg gap when valid</w:t>
+              <w:t>—</w:t>
             </w:r>
           </w:p>
         </w:tc>
@@ -5835,7 +5635,7 @@
           <w:color w:val="23322E"/>
           <w:sz w:val="21"/>
         </w:rPr>
-        <w:t>Guardrail behaviour is itself under test: a configurable rogue mode of the mock model tries to finish before planning and is demonstrably overruled, and malformed-JSON injection exercises the repair round-trip. What remains future work: a broader mission set with confidence intervals, a groundedness grader beyond citation checking, and per-model comparisons across several local models.</w:t>
+        <w:t>Guardrail behaviour is itself under test: an adversarial mode of the reference mock model attempts to finish before planning and is demonstrably overruled, and malformed-JSON injection exercises the repair round-trip. Remaining future work: a broader mission set with confidence intervals, a groundedness grader beyond citation checking, and comparisons across several local models.</w:t>
       </w:r>
     </w:p>
     <w:p>
@@ -6100,7 +5900,7 @@
                 <w:color w:val="23322E"/>
                 <w:sz w:val="16"/>
               </w:rPr>
-              <w:t>Rogue agent behaviour</w:t>
+              <w:t>Non-compliant agent decisions</w:t>
             </w:r>
           </w:p>
         </w:tc>

</xml_diff>